<commit_message>
Updated documents to make to copy and have same style.
</commit_message>
<xml_diff>
--- a/04_QA_Review/Approved/Milestone_5_Algorithms/SDD/JTS_M5_SDD_5.0ComponentDesign_v01.docx
+++ b/04_QA_Review/Approved/Milestone_5_Algorithms/SDD/JTS_M5_SDD_5.0ComponentDesign_v01.docx
@@ -73,54 +73,36 @@
         <w:pStyle w:val="12ptHeading"/>
       </w:pPr>
       <w:r>
-        <w:t>1.2.1 &amp; 1.3.1-ALG example() Algorithm</w:t>
+        <w:t xml:space="preserve">1.2.1 &amp; 1.3.1-ALG </w:t>
+      </w:r>
+      <w:proofErr w:type="gramStart"/>
+      <w:r>
+        <w:t>example(</w:t>
+      </w:r>
+      <w:proofErr w:type="gramEnd"/>
+      <w:r>
+        <w:t>) Algorithm</w:t>
       </w:r>
     </w:p>
     <w:p>
       <w:pPr>
-        <w:pStyle w:val="BodyText"/>
-        <w:spacing w:before="120"/>
-        <w:rPr>
-          <w:rFonts w:ascii="Arial" w:hAnsi="Arial" w:cs="Arial"/>
-          <w:b/>
-          <w:bCs/>
-          <w:sz w:val="22"/>
-          <w:szCs w:val="22"/>
-        </w:rPr>
+        <w:pStyle w:val="Body-Header"/>
       </w:pPr>
       <w:r>
-        <w:rPr>
-          <w:rFonts w:ascii="Arial" w:hAnsi="Arial" w:cs="Arial"/>
-          <w:b/>
-          <w:bCs/>
-          <w:sz w:val="22"/>
-          <w:szCs w:val="22"/>
-        </w:rPr>
         <w:t>Purpose:</w:t>
       </w:r>
     </w:p>
     <w:p>
       <w:pPr>
-        <w:pStyle w:val="BodyText"/>
-        <w:spacing w:before="6" w:after="120"/>
-        <w:rPr>
-          <w:sz w:val="22"/>
-        </w:rPr>
+        <w:pStyle w:val="Intro-Sentence"/>
       </w:pPr>
       <w:r>
-        <w:rPr>
-          <w:sz w:val="22"/>
-        </w:rPr>
         <w:t>Brief sentence explaining what the algorithm does.</w:t>
       </w:r>
     </w:p>
     <w:p>
       <w:pPr>
-        <w:pStyle w:val="BodyText"/>
-        <w:spacing w:before="6"/>
-        <w:rPr>
-          <w:sz w:val="22"/>
-        </w:rPr>
+        <w:pStyle w:val="List-Sentence"/>
       </w:pPr>
       <w:r>
         <w:rPr>
@@ -183,72 +165,31 @@
     </w:p>
     <w:p>
       <w:pPr>
-        <w:pStyle w:val="BodyText"/>
-        <w:spacing w:before="120"/>
-        <w:rPr>
-          <w:rFonts w:ascii="Arial" w:hAnsi="Arial" w:cs="Arial"/>
-          <w:b/>
-          <w:bCs/>
-          <w:sz w:val="22"/>
-          <w:szCs w:val="22"/>
-        </w:rPr>
+        <w:pStyle w:val="Body-Header"/>
       </w:pPr>
       <w:r>
-        <w:rPr>
-          <w:rFonts w:ascii="Arial" w:hAnsi="Arial" w:cs="Arial"/>
-          <w:b/>
-          <w:bCs/>
-          <w:sz w:val="22"/>
-          <w:szCs w:val="22"/>
-        </w:rPr>
         <w:t>Local Data</w:t>
       </w:r>
       <w:r>
-        <w:rPr>
-          <w:rFonts w:ascii="Arial" w:hAnsi="Arial" w:cs="Arial"/>
-          <w:b/>
-          <w:bCs/>
-          <w:sz w:val="22"/>
-          <w:szCs w:val="22"/>
-        </w:rPr>
         <w:t>:</w:t>
       </w:r>
     </w:p>
     <w:p>
       <w:pPr>
-        <w:spacing w:before="6" w:line="240" w:lineRule="auto"/>
-        <w:rPr>
-          <w:rFonts w:ascii="Times New Roman" w:eastAsia="Arial" w:hAnsi="Times New Roman" w:cs="Times New Roman"/>
-          <w:kern w:val="2"/>
-          <w:sz w:val="22"/>
-          <w:szCs w:val="22"/>
-          <w:lang w:eastAsia="en-US"/>
-          <w14:ligatures w14:val="standardContextual"/>
-        </w:rPr>
+        <w:pStyle w:val="List-Sentence"/>
       </w:pPr>
       <w:proofErr w:type="spellStart"/>
+      <w:proofErr w:type="gramStart"/>
       <w:r>
-        <w:rPr>
-          <w:rFonts w:ascii="Times New Roman" w:eastAsia="Arial" w:hAnsi="Times New Roman" w:cs="Times New Roman"/>
-          <w:kern w:val="2"/>
-          <w:sz w:val="22"/>
-          <w:szCs w:val="22"/>
-          <w:lang w:eastAsia="en-US"/>
-          <w14:ligatures w14:val="standardContextual"/>
-        </w:rPr>
         <w:t>newView</w:t>
       </w:r>
       <w:proofErr w:type="spellEnd"/>
       <w:r>
-        <w:rPr>
-          <w:rFonts w:ascii="Times New Roman" w:eastAsia="Arial" w:hAnsi="Times New Roman" w:cs="Times New Roman"/>
-          <w:kern w:val="2"/>
-          <w:sz w:val="22"/>
-          <w:szCs w:val="22"/>
-          <w:lang w:eastAsia="en-US"/>
-          <w14:ligatures w14:val="standardContextual"/>
-        </w:rPr>
-        <w:t xml:space="preserve"> : View</w:t>
+        <w:t xml:space="preserve"> :</w:t>
+      </w:r>
+      <w:proofErr w:type="gramEnd"/>
+      <w:r>
+        <w:t xml:space="preserve"> View</w:t>
       </w:r>
     </w:p>
     <w:p>
@@ -260,6 +201,7 @@
         </w:rPr>
       </w:pPr>
       <w:proofErr w:type="spellStart"/>
+      <w:proofErr w:type="gramStart"/>
       <w:r>
         <w:rPr>
           <w:rFonts w:eastAsia="Arial"/>
@@ -283,7 +225,16 @@
           <w:sz w:val="22"/>
           <w:szCs w:val="22"/>
         </w:rPr>
-        <w:t xml:space="preserve">: </w:t>
+        <w:t>:</w:t>
+      </w:r>
+      <w:proofErr w:type="gramEnd"/>
+      <w:r>
+        <w:rPr>
+          <w:rFonts w:eastAsia="Arial"/>
+          <w:sz w:val="22"/>
+          <w:szCs w:val="22"/>
+        </w:rPr>
+        <w:t xml:space="preserve"> </w:t>
       </w:r>
       <w:r>
         <w:rPr>
@@ -3005,6 +2956,92 @@
       <w:rFonts w:ascii="Times New Roman" w:eastAsia="Times New Roman" w:hAnsi="Times New Roman" w:cs="Times New Roman"/>
     </w:rPr>
   </w:style>
+  <w:style w:type="paragraph" w:customStyle="1" w:styleId="Body-Header">
+    <w:name w:val="Body-Header"/>
+    <w:basedOn w:val="BodyText"/>
+    <w:next w:val="Intro-Sentence"/>
+    <w:link w:val="Body-HeaderChar"/>
+    <w:qFormat/>
+    <w:rsid w:val="009679EC"/>
+    <w:pPr>
+      <w:spacing w:before="120"/>
+    </w:pPr>
+    <w:rPr>
+      <w:rFonts w:ascii="Arial" w:hAnsi="Arial" w:cs="Arial"/>
+      <w:b/>
+      <w:bCs/>
+      <w:sz w:val="22"/>
+      <w:szCs w:val="22"/>
+    </w:rPr>
+  </w:style>
+  <w:style w:type="character" w:customStyle="1" w:styleId="Body-HeaderChar">
+    <w:name w:val="Body-Header Char"/>
+    <w:basedOn w:val="BodyTextChar"/>
+    <w:link w:val="Body-Header"/>
+    <w:rsid w:val="009679EC"/>
+    <w:rPr>
+      <w:rFonts w:ascii="Arial" w:eastAsia="Times New Roman" w:hAnsi="Arial" w:cs="Arial"/>
+      <w:b/>
+      <w:bCs/>
+      <w:sz w:val="22"/>
+      <w:szCs w:val="22"/>
+    </w:rPr>
+  </w:style>
+  <w:style w:type="paragraph" w:customStyle="1" w:styleId="Intro-Sentence">
+    <w:name w:val="Intro-Sentence"/>
+    <w:basedOn w:val="BodyText"/>
+    <w:next w:val="List-Sentence"/>
+    <w:link w:val="Intro-SentenceChar"/>
+    <w:qFormat/>
+    <w:rsid w:val="009679EC"/>
+    <w:pPr>
+      <w:spacing w:before="6" w:after="120"/>
+    </w:pPr>
+    <w:rPr>
+      <w:sz w:val="22"/>
+    </w:rPr>
+  </w:style>
+  <w:style w:type="character" w:customStyle="1" w:styleId="Intro-SentenceChar">
+    <w:name w:val="Intro-Sentence Char"/>
+    <w:basedOn w:val="BodyTextChar"/>
+    <w:link w:val="Intro-Sentence"/>
+    <w:rsid w:val="009679EC"/>
+    <w:rPr>
+      <w:rFonts w:ascii="Times New Roman" w:eastAsia="Times New Roman" w:hAnsi="Times New Roman" w:cs="Times New Roman"/>
+      <w:sz w:val="22"/>
+    </w:rPr>
+  </w:style>
+  <w:style w:type="paragraph" w:customStyle="1" w:styleId="List-Sentence">
+    <w:name w:val="List-Sentence"/>
+    <w:basedOn w:val="Normal"/>
+    <w:link w:val="List-SentenceChar"/>
+    <w:qFormat/>
+    <w:rsid w:val="009679EC"/>
+    <w:pPr>
+      <w:spacing w:before="6" w:line="240" w:lineRule="auto"/>
+    </w:pPr>
+    <w:rPr>
+      <w:rFonts w:ascii="Times New Roman" w:eastAsia="Arial" w:hAnsi="Times New Roman" w:cs="Times New Roman"/>
+      <w:kern w:val="2"/>
+      <w:sz w:val="22"/>
+      <w:szCs w:val="22"/>
+      <w:lang w:eastAsia="en-US"/>
+      <w14:ligatures w14:val="standardContextual"/>
+    </w:rPr>
+  </w:style>
+  <w:style w:type="character" w:customStyle="1" w:styleId="List-SentenceChar">
+    <w:name w:val="List-Sentence Char"/>
+    <w:basedOn w:val="DefaultParagraphFont"/>
+    <w:link w:val="List-Sentence"/>
+    <w:rsid w:val="009679EC"/>
+    <w:rPr>
+      <w:rFonts w:ascii="Times New Roman" w:eastAsia="Arial" w:hAnsi="Times New Roman" w:cs="Times New Roman"/>
+      <w:kern w:val="2"/>
+      <w:sz w:val="22"/>
+      <w:szCs w:val="22"/>
+      <w14:ligatures w14:val="standardContextual"/>
+    </w:rPr>
+  </w:style>
 </w:styles>
 </file>
 

</xml_diff>

<commit_message>
Changed the width of the Pseudocode image to 6.5
</commit_message>
<xml_diff>
--- a/04_QA_Review/Approved/Milestone_5_Algorithms/SDD/JTS_M5_SDD_5.0ComponentDesign_v01.docx
+++ b/04_QA_Review/Approved/Milestone_5_Algorithms/SDD/JTS_M5_SDD_5.0ComponentDesign_v01.docx
@@ -109,9 +109,9 @@
           <w:noProof/>
         </w:rPr>
         <w:drawing>
-          <wp:inline distT="0" distB="0" distL="0" distR="0" wp14:anchorId="70BC33DA" wp14:editId="7F1E1BB1">
-            <wp:extent cx="4410075" cy="1885950"/>
-            <wp:effectExtent l="0" t="0" r="9525" b="0"/>
+          <wp:inline distT="0" distB="0" distL="0" distR="0" wp14:anchorId="70BC33DA" wp14:editId="3AD23658">
+            <wp:extent cx="5943600" cy="2591160"/>
+            <wp:effectExtent l="0" t="0" r="0" b="0"/>
             <wp:docPr id="1867050800" name="Picture 1"/>
             <wp:cNvGraphicFramePr>
               <a:graphicFrameLocks xmlns:a="http://schemas.openxmlformats.org/drawingml/2006/main" noChangeAspect="1"/>
@@ -133,7 +133,7 @@
                         </a:ext>
                       </a:extLst>
                     </a:blip>
-                    <a:srcRect r="9747" b="35922"/>
+                    <a:srcRect r="14596" b="38185"/>
                     <a:stretch>
                       <a:fillRect/>
                     </a:stretch>
@@ -141,7 +141,7 @@
                   <pic:spPr bwMode="auto">
                     <a:xfrm>
                       <a:off x="0" y="0"/>
-                      <a:ext cx="4410075" cy="1885950"/>
+                      <a:ext cx="5943600" cy="2591160"/>
                     </a:xfrm>
                     <a:prstGeom prst="rect">
                       <a:avLst/>
@@ -367,6 +367,7 @@
         <w:pStyle w:val="135ptHeading"/>
       </w:pPr>
       <w:r>
+        <w:lastRenderedPageBreak/>
         <w:t>1.10 Communication Services Algorithms</w:t>
       </w:r>
     </w:p>
@@ -387,7 +388,6 @@
         <w:pStyle w:val="135ptHeading"/>
       </w:pPr>
       <w:r>
-        <w:lastRenderedPageBreak/>
         <w:t>1.11 Recommendation Service Algorithms</w:t>
       </w:r>
     </w:p>

</xml_diff>